<commit_message>
arreglo de inconsistencia y mejorar sprint de la semana
</commit_message>
<xml_diff>
--- a/docs/Sprint 2 proyecto de administracion de proyectos.docx
+++ b/docs/Sprint 2 proyecto de administracion de proyectos.docx
@@ -7594,6 +7594,1528 @@
         <w:rPr>
           <w:rtl w:val="0"/>
         </w:rPr>
+      </w:r>
+    </w:p>
+    <w:p>
+      <w:r>
+        <w:br w:type="page"/>
+      </w:r>
+    </w:p>
+    <w:p>
+      <w:r>
+        <w:br w:type="page"/>
+      </w:r>
+    </w:p>
+    <w:p>
+      <w:pPr>
+        <w:pStyle w:val="Heading1"/>
+      </w:pPr>
+      <w:r>
+        <w:t>Actualización de la Semana 4: backlog, gobernanza y seguimiento</w:t>
+      </w:r>
+    </w:p>
+    <w:p>
+      <w:r>
+        <w:t>En esta parte se agregan los elementos trabajados durante la Semana 4 para completar el planeamiento del proyecto.</w:t>
+      </w:r>
+    </w:p>
+    <w:p>
+      <w:pPr>
+        <w:pStyle w:val="Heading1"/>
+      </w:pPr>
+      <w:r>
+        <w:t>13. Interacción entre los grupos de procesos</w:t>
+      </w:r>
+    </w:p>
+    <w:p>
+      <w:r>
+        <w:t>Aunque los procesos aparecen separados, durante el proyecto se relacionan. Lo que se obtiene en una etapa se utiliza en la siguiente y, si aparece un cambio, puede ser necesario revisar lo que ya se había planeado.</w:t>
+      </w:r>
+    </w:p>
+    <w:tbl>
+      <w:tblPr>
+        <w:tblW w:type="auto" w:w="0"/>
+        <w:tblLook w:firstColumn="1" w:firstRow="1" w:lastColumn="0" w:lastRow="0" w:noHBand="0" w:noVBand="1" w:val="04A0"/>
+      </w:tblPr>
+      <w:tblGrid>
+        <w:gridCol w:w="3010"/>
+        <w:gridCol w:w="3010"/>
+        <w:gridCol w:w="3010"/>
+      </w:tblGrid>
+      <w:tr>
+        <w:tc>
+          <w:tcPr>
+            <w:tcW w:type="dxa" w:w="3010"/>
+          </w:tcPr>
+          <w:p>
+            <w:r>
+              <w:t>Proceso</w:t>
+            </w:r>
+          </w:p>
+        </w:tc>
+        <w:tc>
+          <w:tcPr>
+            <w:tcW w:type="dxa" w:w="3010"/>
+          </w:tcPr>
+          <w:p>
+            <w:r>
+              <w:t>Qué se obtiene</w:t>
+            </w:r>
+          </w:p>
+        </w:tc>
+        <w:tc>
+          <w:tcPr>
+            <w:tcW w:type="dxa" w:w="3010"/>
+          </w:tcPr>
+          <w:p>
+            <w:r>
+              <w:t>Para qué se utiliza</w:t>
+            </w:r>
+          </w:p>
+        </w:tc>
+      </w:tr>
+      <w:tr>
+        <w:tc>
+          <w:tcPr>
+            <w:tcW w:type="dxa" w:w="3010"/>
+          </w:tcPr>
+          <w:p>
+            <w:r>
+              <w:t>Inicio</w:t>
+            </w:r>
+          </w:p>
+        </w:tc>
+        <w:tc>
+          <w:tcPr>
+            <w:tcW w:type="dxa" w:w="3010"/>
+          </w:tcPr>
+          <w:p>
+            <w:r>
+              <w:t>Problema, objetivos e interesados.</w:t>
+            </w:r>
+          </w:p>
+        </w:tc>
+        <w:tc>
+          <w:tcPr>
+            <w:tcW w:type="dxa" w:w="3010"/>
+          </w:tcPr>
+          <w:p>
+            <w:r>
+              <w:t>Decidir el alcance y las prioridades.</w:t>
+            </w:r>
+          </w:p>
+        </w:tc>
+      </w:tr>
+      <w:tr>
+        <w:tc>
+          <w:tcPr>
+            <w:tcW w:type="dxa" w:w="3010"/>
+          </w:tcPr>
+          <w:p>
+            <w:r>
+              <w:t>Planificación</w:t>
+            </w:r>
+          </w:p>
+        </w:tc>
+        <w:tc>
+          <w:tcPr>
+            <w:tcW w:type="dxa" w:w="3010"/>
+          </w:tcPr>
+          <w:p>
+            <w:r>
+              <w:t>Alcance, reglas y backlogs.</w:t>
+            </w:r>
+          </w:p>
+        </w:tc>
+        <w:tc>
+          <w:tcPr>
+            <w:tcW w:type="dxa" w:w="3010"/>
+          </w:tcPr>
+          <w:p>
+            <w:r>
+              <w:t>Guiar el trabajo del Sprint.</w:t>
+            </w:r>
+          </w:p>
+        </w:tc>
+      </w:tr>
+      <w:tr>
+        <w:tc>
+          <w:tcPr>
+            <w:tcW w:type="dxa" w:w="3010"/>
+          </w:tcPr>
+          <w:p>
+            <w:r>
+              <w:t>Ejecución o simulación</w:t>
+            </w:r>
+          </w:p>
+        </w:tc>
+        <w:tc>
+          <w:tcPr>
+            <w:tcW w:type="dxa" w:w="3010"/>
+          </w:tcPr>
+          <w:p>
+            <w:r>
+              <w:t>Documentos, modelos o avances.</w:t>
+            </w:r>
+          </w:p>
+        </w:tc>
+        <w:tc>
+          <w:tcPr>
+            <w:tcW w:type="dxa" w:w="3010"/>
+          </w:tcPr>
+          <w:p>
+            <w:r>
+              <w:t>Revisar lo realizado.</w:t>
+            </w:r>
+          </w:p>
+        </w:tc>
+      </w:tr>
+      <w:tr>
+        <w:tc>
+          <w:tcPr>
+            <w:tcW w:type="dxa" w:w="3010"/>
+          </w:tcPr>
+          <w:p>
+            <w:r>
+              <w:t>Seguimiento y control</w:t>
+            </w:r>
+          </w:p>
+        </w:tc>
+        <w:tc>
+          <w:tcPr>
+            <w:tcW w:type="dxa" w:w="3010"/>
+          </w:tcPr>
+          <w:p>
+            <w:r>
+              <w:t>Estado y cambios encontrados.</w:t>
+            </w:r>
+          </w:p>
+        </w:tc>
+        <w:tc>
+          <w:tcPr>
+            <w:tcW w:type="dxa" w:w="3010"/>
+          </w:tcPr>
+          <w:p>
+            <w:r>
+              <w:t>Corregir el plan y ordenar el backlog.</w:t>
+            </w:r>
+          </w:p>
+        </w:tc>
+      </w:tr>
+      <w:tr>
+        <w:tc>
+          <w:tcPr>
+            <w:tcW w:type="dxa" w:w="3010"/>
+          </w:tcPr>
+          <w:p>
+            <w:r>
+              <w:t>Cierre</w:t>
+            </w:r>
+          </w:p>
+        </w:tc>
+        <w:tc>
+          <w:tcPr>
+            <w:tcW w:type="dxa" w:w="3010"/>
+          </w:tcPr>
+          <w:p>
+            <w:r>
+              <w:t>Resultado y lecciones aprendidas.</w:t>
+            </w:r>
+          </w:p>
+        </w:tc>
+        <w:tc>
+          <w:tcPr>
+            <w:tcW w:type="dxa" w:w="3010"/>
+          </w:tcPr>
+          <w:p>
+            <w:r>
+              <w:t>Preparar el Sprint siguiente.</w:t>
+            </w:r>
+          </w:p>
+        </w:tc>
+      </w:tr>
+    </w:tbl>
+    <w:p>
+      <w:r>
+        <w:t>Por ejemplo, si la consulta del saldo resulta más importante que los reportes, se cambia el orden del Product Backlog y se toma en cuenta esa prioridad para el Sprint siguiente. El seguimiento se realiza mientras se trabaja y no solo al final.</w:t>
+      </w:r>
+    </w:p>
+    <w:p>
+      <w:pPr>
+        <w:pStyle w:val="Heading1"/>
+      </w:pPr>
+      <w:r>
+        <w:t>14. Gobernanza y control de cambios</w:t>
+      </w:r>
+    </w:p>
+    <w:p>
+      <w:r>
+        <w:t>Para evitar cambios sin revisar, se definió de forma general quién puede tomar cada decisión.</w:t>
+      </w:r>
+    </w:p>
+    <w:tbl>
+      <w:tblPr>
+        <w:tblW w:type="auto" w:w="0"/>
+        <w:tblLook w:firstColumn="1" w:firstRow="1" w:lastColumn="0" w:lastRow="0" w:noHBand="0" w:noVBand="1" w:val="04A0"/>
+      </w:tblPr>
+      <w:tblGrid>
+        <w:gridCol w:w="3010"/>
+        <w:gridCol w:w="3010"/>
+        <w:gridCol w:w="3010"/>
+      </w:tblGrid>
+      <w:tr>
+        <w:tc>
+          <w:tcPr>
+            <w:tcW w:type="dxa" w:w="3010"/>
+          </w:tcPr>
+          <w:p>
+            <w:r>
+              <w:t>Tipo de decisión</w:t>
+            </w:r>
+          </w:p>
+        </w:tc>
+        <w:tc>
+          <w:tcPr>
+            <w:tcW w:type="dxa" w:w="3010"/>
+          </w:tcPr>
+          <w:p>
+            <w:r>
+              <w:t>Quién puede proponerla</w:t>
+            </w:r>
+          </w:p>
+        </w:tc>
+        <w:tc>
+          <w:tcPr>
+            <w:tcW w:type="dxa" w:w="3010"/>
+          </w:tcPr>
+          <w:p>
+            <w:r>
+              <w:t>Quién la revisa</w:t>
+            </w:r>
+          </w:p>
+        </w:tc>
+      </w:tr>
+      <w:tr>
+        <w:tc>
+          <w:tcPr>
+            <w:tcW w:type="dxa" w:w="3010"/>
+          </w:tcPr>
+          <w:p>
+            <w:r>
+              <w:t>Prioridad de una necesidad</w:t>
+            </w:r>
+          </w:p>
+        </w:tc>
+        <w:tc>
+          <w:tcPr>
+            <w:tcW w:type="dxa" w:w="3010"/>
+          </w:tcPr>
+          <w:p>
+            <w:r>
+              <w:t>Dueño, usuarios o equipo</w:t>
+            </w:r>
+          </w:p>
+        </w:tc>
+        <w:tc>
+          <w:tcPr>
+            <w:tcW w:type="dxa" w:w="3010"/>
+          </w:tcPr>
+          <w:p>
+            <w:r>
+              <w:t>Dueño o administrador</w:t>
+            </w:r>
+          </w:p>
+        </w:tc>
+      </w:tr>
+      <w:tr>
+        <w:tc>
+          <w:tcPr>
+            <w:tcW w:type="dxa" w:w="3010"/>
+          </w:tcPr>
+          <w:p>
+            <w:r>
+              <w:t>Forma de organizar la solución</w:t>
+            </w:r>
+          </w:p>
+        </w:tc>
+        <w:tc>
+          <w:tcPr>
+            <w:tcW w:type="dxa" w:w="3010"/>
+          </w:tcPr>
+          <w:p>
+            <w:r>
+              <w:t>Equipo</w:t>
+            </w:r>
+          </w:p>
+        </w:tc>
+        <w:tc>
+          <w:tcPr>
+            <w:tcW w:type="dxa" w:w="3010"/>
+          </w:tcPr>
+          <w:p>
+            <w:r>
+              <w:t>Cristopher y Miguel</w:t>
+            </w:r>
+          </w:p>
+        </w:tc>
+      </w:tr>
+      <w:tr>
+        <w:tc>
+          <w:tcPr>
+            <w:tcW w:type="dxa" w:w="3010"/>
+          </w:tcPr>
+          <w:p>
+            <w:r>
+              <w:t>Requisitos de la entrega</w:t>
+            </w:r>
+          </w:p>
+        </w:tc>
+        <w:tc>
+          <w:tcPr>
+            <w:tcW w:type="dxa" w:w="3010"/>
+          </w:tcPr>
+          <w:p>
+            <w:r>
+              <w:t>Equipo o profesor</w:t>
+            </w:r>
+          </w:p>
+        </w:tc>
+        <w:tc>
+          <w:tcPr>
+            <w:tcW w:type="dxa" w:w="3010"/>
+          </w:tcPr>
+          <w:p>
+            <w:r>
+              <w:t>Profesor</w:t>
+            </w:r>
+          </w:p>
+        </w:tc>
+      </w:tr>
+      <w:tr>
+        <w:tc>
+          <w:tcPr>
+            <w:tcW w:type="dxa" w:w="3010"/>
+          </w:tcPr>
+          <w:p>
+            <w:r>
+              <w:t>Cambio de alcance o regla</w:t>
+            </w:r>
+          </w:p>
+        </w:tc>
+        <w:tc>
+          <w:tcPr>
+            <w:tcW w:type="dxa" w:w="3010"/>
+          </w:tcPr>
+          <w:p>
+            <w:r>
+              <w:t>Cualquier interesado</w:t>
+            </w:r>
+          </w:p>
+        </w:tc>
+        <w:tc>
+          <w:tcPr>
+            <w:tcW w:type="dxa" w:w="3010"/>
+          </w:tcPr>
+          <w:p>
+            <w:r>
+              <w:t>Dueño y equipo</w:t>
+            </w:r>
+          </w:p>
+        </w:tc>
+      </w:tr>
+    </w:tbl>
+    <w:p>
+      <w:r>
+        <w:t>Cuando aparezca un cambio, primero se anotará qué se quiere modificar y por qué. Después se revisará si afecta el alcance, el tiempo o alguna regla. Si se acepta, se actualizarán el backlog y las secciones relacionadas.</w:t>
+      </w:r>
+    </w:p>
+    <w:p>
+      <w:pPr>
+        <w:pStyle w:val="Heading1"/>
+      </w:pPr>
+      <w:r>
+        <w:t>15. Product Backlog inicial</w:t>
+      </w:r>
+    </w:p>
+    <w:p>
+      <w:r>
+        <w:t>El Product Backlog se ordenó tomando en cuenta la importancia de cada función y las dependencias entre ellas. No se considera una lista definitiva y podrá cambiar cuando aparezca información nueva.</w:t>
+      </w:r>
+    </w:p>
+    <w:tbl>
+      <w:tblPr>
+        <w:tblW w:type="auto" w:w="0"/>
+        <w:tblLook w:firstColumn="1" w:firstRow="1" w:lastColumn="0" w:lastRow="0" w:noHBand="0" w:noVBand="1" w:val="04A0"/>
+      </w:tblPr>
+      <w:tblGrid>
+        <w:gridCol w:w="2257"/>
+        <w:gridCol w:w="2257"/>
+        <w:gridCol w:w="2257"/>
+        <w:gridCol w:w="2257"/>
+      </w:tblGrid>
+      <w:tr>
+        <w:tc>
+          <w:tcPr>
+            <w:tcW w:type="dxa" w:w="2257"/>
+          </w:tcPr>
+          <w:p>
+            <w:r>
+              <w:t>Orden</w:t>
+            </w:r>
+          </w:p>
+        </w:tc>
+        <w:tc>
+          <w:tcPr>
+            <w:tcW w:type="dxa" w:w="2257"/>
+          </w:tcPr>
+          <w:p>
+            <w:r>
+              <w:t>Código</w:t>
+            </w:r>
+          </w:p>
+        </w:tc>
+        <w:tc>
+          <w:tcPr>
+            <w:tcW w:type="dxa" w:w="2257"/>
+          </w:tcPr>
+          <w:p>
+            <w:r>
+              <w:t>Historia resumida</w:t>
+            </w:r>
+          </w:p>
+        </w:tc>
+        <w:tc>
+          <w:tcPr>
+            <w:tcW w:type="dxa" w:w="2257"/>
+          </w:tcPr>
+          <w:p>
+            <w:r>
+              <w:t>Prioridad</w:t>
+            </w:r>
+          </w:p>
+        </w:tc>
+      </w:tr>
+      <w:tr>
+        <w:tc>
+          <w:tcPr>
+            <w:tcW w:type="dxa" w:w="2257"/>
+          </w:tcPr>
+          <w:p>
+            <w:r>
+              <w:t>1</w:t>
+            </w:r>
+          </w:p>
+        </w:tc>
+        <w:tc>
+          <w:tcPr>
+            <w:tcW w:type="dxa" w:w="2257"/>
+          </w:tcPr>
+          <w:p>
+            <w:r>
+              <w:t>HU-01</w:t>
+            </w:r>
+          </w:p>
+        </w:tc>
+        <w:tc>
+          <w:tcPr>
+            <w:tcW w:type="dxa" w:w="2257"/>
+          </w:tcPr>
+          <w:p>
+            <w:r>
+              <w:t>Registrar empresas con convenio.</w:t>
+            </w:r>
+          </w:p>
+        </w:tc>
+        <w:tc>
+          <w:tcPr>
+            <w:tcW w:type="dxa" w:w="2257"/>
+          </w:tcPr>
+          <w:p>
+            <w:r>
+              <w:t>Alta</w:t>
+            </w:r>
+          </w:p>
+        </w:tc>
+      </w:tr>
+      <w:tr>
+        <w:tc>
+          <w:tcPr>
+            <w:tcW w:type="dxa" w:w="2257"/>
+          </w:tcPr>
+          <w:p>
+            <w:r>
+              <w:t>2</w:t>
+            </w:r>
+          </w:p>
+        </w:tc>
+        <w:tc>
+          <w:tcPr>
+            <w:tcW w:type="dxa" w:w="2257"/>
+          </w:tcPr>
+          <w:p>
+            <w:r>
+              <w:t>HU-02</w:t>
+            </w:r>
+          </w:p>
+        </w:tc>
+        <w:tc>
+          <w:tcPr>
+            <w:tcW w:type="dxa" w:w="2257"/>
+          </w:tcPr>
+          <w:p>
+            <w:r>
+              <w:t>Registrar clientes y asociarlos con su empresa.</w:t>
+            </w:r>
+          </w:p>
+        </w:tc>
+        <w:tc>
+          <w:tcPr>
+            <w:tcW w:type="dxa" w:w="2257"/>
+          </w:tcPr>
+          <w:p>
+            <w:r>
+              <w:t>Alta</w:t>
+            </w:r>
+          </w:p>
+        </w:tc>
+      </w:tr>
+      <w:tr>
+        <w:tc>
+          <w:tcPr>
+            <w:tcW w:type="dxa" w:w="2257"/>
+          </w:tcPr>
+          <w:p>
+            <w:r>
+              <w:t>3</w:t>
+            </w:r>
+          </w:p>
+        </w:tc>
+        <w:tc>
+          <w:tcPr>
+            <w:tcW w:type="dxa" w:w="2257"/>
+          </w:tcPr>
+          <w:p>
+            <w:r>
+              <w:t>HU-03</w:t>
+            </w:r>
+          </w:p>
+        </w:tc>
+        <w:tc>
+          <w:tcPr>
+            <w:tcW w:type="dxa" w:w="2257"/>
+          </w:tcPr>
+          <w:p>
+            <w:r>
+              <w:t>Crear cuentas y establecer límites.</w:t>
+            </w:r>
+          </w:p>
+        </w:tc>
+        <w:tc>
+          <w:tcPr>
+            <w:tcW w:type="dxa" w:w="2257"/>
+          </w:tcPr>
+          <w:p>
+            <w:r>
+              <w:t>Alta</w:t>
+            </w:r>
+          </w:p>
+        </w:tc>
+      </w:tr>
+      <w:tr>
+        <w:tc>
+          <w:tcPr>
+            <w:tcW w:type="dxa" w:w="2257"/>
+          </w:tcPr>
+          <w:p>
+            <w:r>
+              <w:t>4</w:t>
+            </w:r>
+          </w:p>
+        </w:tc>
+        <w:tc>
+          <w:tcPr>
+            <w:tcW w:type="dxa" w:w="2257"/>
+          </w:tcPr>
+          <w:p>
+            <w:r>
+              <w:t>HU-04</w:t>
+            </w:r>
+          </w:p>
+        </w:tc>
+        <w:tc>
+          <w:tcPr>
+            <w:tcW w:type="dxa" w:w="2257"/>
+          </w:tcPr>
+          <w:p>
+            <w:r>
+              <w:t>Consultar el saldo disponible.</w:t>
+            </w:r>
+          </w:p>
+        </w:tc>
+        <w:tc>
+          <w:tcPr>
+            <w:tcW w:type="dxa" w:w="2257"/>
+          </w:tcPr>
+          <w:p>
+            <w:r>
+              <w:t>Alta</w:t>
+            </w:r>
+          </w:p>
+        </w:tc>
+      </w:tr>
+      <w:tr>
+        <w:tc>
+          <w:tcPr>
+            <w:tcW w:type="dxa" w:w="2257"/>
+          </w:tcPr>
+          <w:p>
+            <w:r>
+              <w:t>5</w:t>
+            </w:r>
+          </w:p>
+        </w:tc>
+        <w:tc>
+          <w:tcPr>
+            <w:tcW w:type="dxa" w:w="2257"/>
+          </w:tcPr>
+          <w:p>
+            <w:r>
+              <w:t>HU-05</w:t>
+            </w:r>
+          </w:p>
+        </w:tc>
+        <w:tc>
+          <w:tcPr>
+            <w:tcW w:type="dxa" w:w="2257"/>
+          </w:tcPr>
+          <w:p>
+            <w:r>
+              <w:t>Registrar compras a crédito.</w:t>
+            </w:r>
+          </w:p>
+        </w:tc>
+        <w:tc>
+          <w:tcPr>
+            <w:tcW w:type="dxa" w:w="2257"/>
+          </w:tcPr>
+          <w:p>
+            <w:r>
+              <w:t>Alta</w:t>
+            </w:r>
+          </w:p>
+        </w:tc>
+      </w:tr>
+      <w:tr>
+        <w:tc>
+          <w:tcPr>
+            <w:tcW w:type="dxa" w:w="2257"/>
+          </w:tcPr>
+          <w:p>
+            <w:r>
+              <w:t>6</w:t>
+            </w:r>
+          </w:p>
+        </w:tc>
+        <w:tc>
+          <w:tcPr>
+            <w:tcW w:type="dxa" w:w="2257"/>
+          </w:tcPr>
+          <w:p>
+            <w:r>
+              <w:t>HU-06</w:t>
+            </w:r>
+          </w:p>
+        </w:tc>
+        <w:tc>
+          <w:tcPr>
+            <w:tcW w:type="dxa" w:w="2257"/>
+          </w:tcPr>
+          <w:p>
+            <w:r>
+              <w:t>Registrar pagos o abonos.</w:t>
+            </w:r>
+          </w:p>
+        </w:tc>
+        <w:tc>
+          <w:tcPr>
+            <w:tcW w:type="dxa" w:w="2257"/>
+          </w:tcPr>
+          <w:p>
+            <w:r>
+              <w:t>Alta</w:t>
+            </w:r>
+          </w:p>
+        </w:tc>
+      </w:tr>
+      <w:tr>
+        <w:tc>
+          <w:tcPr>
+            <w:tcW w:type="dxa" w:w="2257"/>
+          </w:tcPr>
+          <w:p>
+            <w:r>
+              <w:t>7</w:t>
+            </w:r>
+          </w:p>
+        </w:tc>
+        <w:tc>
+          <w:tcPr>
+            <w:tcW w:type="dxa" w:w="2257"/>
+          </w:tcPr>
+          <w:p>
+            <w:r>
+              <w:t>HU-07</w:t>
+            </w:r>
+          </w:p>
+        </w:tc>
+        <w:tc>
+          <w:tcPr>
+            <w:tcW w:type="dxa" w:w="2257"/>
+          </w:tcPr>
+          <w:p>
+            <w:r>
+              <w:t>Gestionar permisos de usuarios.</w:t>
+            </w:r>
+          </w:p>
+        </w:tc>
+        <w:tc>
+          <w:tcPr>
+            <w:tcW w:type="dxa" w:w="2257"/>
+          </w:tcPr>
+          <w:p>
+            <w:r>
+              <w:t>Alta</w:t>
+            </w:r>
+          </w:p>
+        </w:tc>
+      </w:tr>
+      <w:tr>
+        <w:tc>
+          <w:tcPr>
+            <w:tcW w:type="dxa" w:w="2257"/>
+          </w:tcPr>
+          <w:p>
+            <w:r>
+              <w:t>8</w:t>
+            </w:r>
+          </w:p>
+        </w:tc>
+        <w:tc>
+          <w:tcPr>
+            <w:tcW w:type="dxa" w:w="2257"/>
+          </w:tcPr>
+          <w:p>
+            <w:r>
+              <w:t>HU-08</w:t>
+            </w:r>
+          </w:p>
+        </w:tc>
+        <w:tc>
+          <w:tcPr>
+            <w:tcW w:type="dxa" w:w="2257"/>
+          </w:tcPr>
+          <w:p>
+            <w:r>
+              <w:t>Consultar el historial.</w:t>
+            </w:r>
+          </w:p>
+        </w:tc>
+        <w:tc>
+          <w:tcPr>
+            <w:tcW w:type="dxa" w:w="2257"/>
+          </w:tcPr>
+          <w:p>
+            <w:r>
+              <w:t>Media</w:t>
+            </w:r>
+          </w:p>
+        </w:tc>
+      </w:tr>
+      <w:tr>
+        <w:tc>
+          <w:tcPr>
+            <w:tcW w:type="dxa" w:w="2257"/>
+          </w:tcPr>
+          <w:p>
+            <w:r>
+              <w:t>9</w:t>
+            </w:r>
+          </w:p>
+        </w:tc>
+        <w:tc>
+          <w:tcPr>
+            <w:tcW w:type="dxa" w:w="2257"/>
+          </w:tcPr>
+          <w:p>
+            <w:r>
+              <w:t>HU-10</w:t>
+            </w:r>
+          </w:p>
+        </w:tc>
+        <w:tc>
+          <w:tcPr>
+            <w:tcW w:type="dxa" w:w="2257"/>
+          </w:tcPr>
+          <w:p>
+            <w:r>
+              <w:t>Gestionar estados de cuentas.</w:t>
+            </w:r>
+          </w:p>
+        </w:tc>
+        <w:tc>
+          <w:tcPr>
+            <w:tcW w:type="dxa" w:w="2257"/>
+          </w:tcPr>
+          <w:p>
+            <w:r>
+              <w:t>Media</w:t>
+            </w:r>
+          </w:p>
+        </w:tc>
+      </w:tr>
+      <w:tr>
+        <w:tc>
+          <w:tcPr>
+            <w:tcW w:type="dxa" w:w="2257"/>
+          </w:tcPr>
+          <w:p>
+            <w:r>
+              <w:t>10</w:t>
+            </w:r>
+          </w:p>
+        </w:tc>
+        <w:tc>
+          <w:tcPr>
+            <w:tcW w:type="dxa" w:w="2257"/>
+          </w:tcPr>
+          <w:p>
+            <w:r>
+              <w:t>HU-09</w:t>
+            </w:r>
+          </w:p>
+        </w:tc>
+        <w:tc>
+          <w:tcPr>
+            <w:tcW w:type="dxa" w:w="2257"/>
+          </w:tcPr>
+          <w:p>
+            <w:r>
+              <w:t>Consultar reportes.</w:t>
+            </w:r>
+          </w:p>
+        </w:tc>
+        <w:tc>
+          <w:tcPr>
+            <w:tcW w:type="dxa" w:w="2257"/>
+          </w:tcPr>
+          <w:p>
+            <w:r>
+              <w:t>Media</w:t>
+            </w:r>
+          </w:p>
+        </w:tc>
+      </w:tr>
+    </w:tbl>
+    <w:p>
+      <w:r>
+        <w:t>Si es necesario, el equipo podrá aclarar una historia, dividirla, agregar condiciones para comprobarla o cambiarla de posición.</w:t>
+      </w:r>
+    </w:p>
+    <w:p>
+      <w:pPr>
+        <w:pStyle w:val="Heading1"/>
+      </w:pPr>
+      <w:r>
+        <w:t>16. Sprint Backlog del Sprint 2</w:t>
+      </w:r>
+    </w:p>
+    <w:p>
+      <w:r>
+        <w:rPr>
+          <w:b/>
+        </w:rPr>
+        <w:t xml:space="preserve">Sprint Goal: </w:t>
+      </w:r>
+      <w:r>
+        <w:t>definir y organizar las funciones, los procesos y las reglas principales del sistema.</w:t>
+      </w:r>
+    </w:p>
+    <w:p>
+      <w:r>
+        <w:t>En este Sprint se preparará la documentación. Todavía no se programará la aplicación.</w:t>
+      </w:r>
+    </w:p>
+    <w:p>
+      <w:pPr>
+        <w:pStyle w:val="Heading2"/>
+      </w:pPr>
+      <w:r>
+        <w:t>16.1 Historias seleccionadas</w:t>
+      </w:r>
+    </w:p>
+    <w:tbl>
+      <w:tblPr>
+        <w:tblW w:type="auto" w:w="0"/>
+        <w:tblLook w:firstColumn="1" w:firstRow="1" w:lastColumn="0" w:lastRow="0" w:noHBand="0" w:noVBand="1" w:val="04A0"/>
+      </w:tblPr>
+      <w:tblGrid>
+        <w:gridCol w:w="3010"/>
+        <w:gridCol w:w="3010"/>
+        <w:gridCol w:w="3010"/>
+      </w:tblGrid>
+      <w:tr>
+        <w:tc>
+          <w:tcPr>
+            <w:tcW w:type="dxa" w:w="3010"/>
+          </w:tcPr>
+          <w:p>
+            <w:r>
+              <w:t>Orden</w:t>
+            </w:r>
+          </w:p>
+        </w:tc>
+        <w:tc>
+          <w:tcPr>
+            <w:tcW w:type="dxa" w:w="3010"/>
+          </w:tcPr>
+          <w:p>
+            <w:r>
+              <w:t>Historia</w:t>
+            </w:r>
+          </w:p>
+        </w:tc>
+        <w:tc>
+          <w:tcPr>
+            <w:tcW w:type="dxa" w:w="3010"/>
+          </w:tcPr>
+          <w:p>
+            <w:r>
+              <w:t>Motivo</w:t>
+            </w:r>
+          </w:p>
+        </w:tc>
+      </w:tr>
+      <w:tr>
+        <w:tc>
+          <w:tcPr>
+            <w:tcW w:type="dxa" w:w="3010"/>
+          </w:tcPr>
+          <w:p>
+            <w:r>
+              <w:t>1</w:t>
+            </w:r>
+          </w:p>
+        </w:tc>
+        <w:tc>
+          <w:tcPr>
+            <w:tcW w:type="dxa" w:w="3010"/>
+          </w:tcPr>
+          <w:p>
+            <w:r>
+              <w:t>HU-01</w:t>
+            </w:r>
+          </w:p>
+        </w:tc>
+        <w:tc>
+          <w:tcPr>
+            <w:tcW w:type="dxa" w:w="3010"/>
+          </w:tcPr>
+          <w:p>
+            <w:r>
+              <w:t>Primero se necesitan las empresas y convenios.</w:t>
+            </w:r>
+          </w:p>
+        </w:tc>
+      </w:tr>
+      <w:tr>
+        <w:tc>
+          <w:tcPr>
+            <w:tcW w:type="dxa" w:w="3010"/>
+          </w:tcPr>
+          <w:p>
+            <w:r>
+              <w:t>2</w:t>
+            </w:r>
+          </w:p>
+        </w:tc>
+        <w:tc>
+          <w:tcPr>
+            <w:tcW w:type="dxa" w:w="3010"/>
+          </w:tcPr>
+          <w:p>
+            <w:r>
+              <w:t>HU-02</w:t>
+            </w:r>
+          </w:p>
+        </w:tc>
+        <w:tc>
+          <w:tcPr>
+            <w:tcW w:type="dxa" w:w="3010"/>
+          </w:tcPr>
+          <w:p>
+            <w:r>
+              <w:t>Los clientes deben quedar asociados con una empresa.</w:t>
+            </w:r>
+          </w:p>
+        </w:tc>
+      </w:tr>
+      <w:tr>
+        <w:tc>
+          <w:tcPr>
+            <w:tcW w:type="dxa" w:w="3010"/>
+          </w:tcPr>
+          <w:p>
+            <w:r>
+              <w:t>3</w:t>
+            </w:r>
+          </w:p>
+        </w:tc>
+        <w:tc>
+          <w:tcPr>
+            <w:tcW w:type="dxa" w:w="3010"/>
+          </w:tcPr>
+          <w:p>
+            <w:r>
+              <w:t>HU-03</w:t>
+            </w:r>
+          </w:p>
+        </w:tc>
+        <w:tc>
+          <w:tcPr>
+            <w:tcW w:type="dxa" w:w="3010"/>
+          </w:tcPr>
+          <w:p>
+            <w:r>
+              <w:t>La cuenta permite controlar el crédito.</w:t>
+            </w:r>
+          </w:p>
+        </w:tc>
+      </w:tr>
+      <w:tr>
+        <w:tc>
+          <w:tcPr>
+            <w:tcW w:type="dxa" w:w="3010"/>
+          </w:tcPr>
+          <w:p>
+            <w:r>
+              <w:t>4</w:t>
+            </w:r>
+          </w:p>
+        </w:tc>
+        <w:tc>
+          <w:tcPr>
+            <w:tcW w:type="dxa" w:w="3010"/>
+          </w:tcPr>
+          <w:p>
+            <w:r>
+              <w:t>HU-04</w:t>
+            </w:r>
+          </w:p>
+        </w:tc>
+        <w:tc>
+          <w:tcPr>
+            <w:tcW w:type="dxa" w:w="3010"/>
+          </w:tcPr>
+          <w:p>
+            <w:r>
+              <w:t>El cajero necesita consultar el saldo.</w:t>
+            </w:r>
+          </w:p>
+        </w:tc>
+      </w:tr>
+      <w:tr>
+        <w:tc>
+          <w:tcPr>
+            <w:tcW w:type="dxa" w:w="3010"/>
+          </w:tcPr>
+          <w:p>
+            <w:r>
+              <w:t>5</w:t>
+            </w:r>
+          </w:p>
+        </w:tc>
+        <w:tc>
+          <w:tcPr>
+            <w:tcW w:type="dxa" w:w="3010"/>
+          </w:tcPr>
+          <w:p>
+            <w:r>
+              <w:t>HU-05</w:t>
+            </w:r>
+          </w:p>
+        </w:tc>
+        <w:tc>
+          <w:tcPr>
+            <w:tcW w:type="dxa" w:w="3010"/>
+          </w:tcPr>
+          <w:p>
+            <w:r>
+              <w:t>La compra es una operación principal.</w:t>
+            </w:r>
+          </w:p>
+        </w:tc>
+      </w:tr>
+      <w:tr>
+        <w:tc>
+          <w:tcPr>
+            <w:tcW w:type="dxa" w:w="3010"/>
+          </w:tcPr>
+          <w:p>
+            <w:r>
+              <w:t>6</w:t>
+            </w:r>
+          </w:p>
+        </w:tc>
+        <w:tc>
+          <w:tcPr>
+            <w:tcW w:type="dxa" w:w="3010"/>
+          </w:tcPr>
+          <w:p>
+            <w:r>
+              <w:t>HU-06</w:t>
+            </w:r>
+          </w:p>
+        </w:tc>
+        <w:tc>
+          <w:tcPr>
+            <w:tcW w:type="dxa" w:w="3010"/>
+          </w:tcPr>
+          <w:p>
+            <w:r>
+              <w:t>El abono completa el ciclo de la deuda.</w:t>
+            </w:r>
+          </w:p>
+        </w:tc>
+      </w:tr>
+    </w:tbl>
+    <w:p>
+      <w:r>
+        <w:t>Las historias HU-07 a HU-10 quedan pendientes para otro Sprint.</w:t>
+      </w:r>
+    </w:p>
+    <w:p>
+      <w:pPr>
+        <w:pStyle w:val="Heading2"/>
+      </w:pPr>
+      <w:r>
+        <w:t>16.2 Actividades del Sprint</w:t>
+      </w:r>
+    </w:p>
+    <w:tbl>
+      <w:tblPr>
+        <w:tblW w:type="auto" w:w="0"/>
+        <w:tblLook w:firstColumn="1" w:firstRow="1" w:lastColumn="0" w:lastRow="0" w:noHBand="0" w:noVBand="1" w:val="04A0"/>
+      </w:tblPr>
+      <w:tblGrid>
+        <w:gridCol w:w="3010"/>
+        <w:gridCol w:w="3010"/>
+        <w:gridCol w:w="3010"/>
+      </w:tblGrid>
+      <w:tr>
+        <w:tc>
+          <w:tcPr>
+            <w:tcW w:type="dxa" w:w="3010"/>
+          </w:tcPr>
+          <w:p>
+            <w:r>
+              <w:t>Código</w:t>
+            </w:r>
+          </w:p>
+        </w:tc>
+        <w:tc>
+          <w:tcPr>
+            <w:tcW w:type="dxa" w:w="3010"/>
+          </w:tcPr>
+          <w:p>
+            <w:r>
+              <w:t>Actividad</w:t>
+            </w:r>
+          </w:p>
+        </w:tc>
+        <w:tc>
+          <w:tcPr>
+            <w:tcW w:type="dxa" w:w="3010"/>
+          </w:tcPr>
+          <w:p>
+            <w:r>
+              <w:t>Responsable</w:t>
+            </w:r>
+          </w:p>
+        </w:tc>
+      </w:tr>
+      <w:tr>
+        <w:tc>
+          <w:tcPr>
+            <w:tcW w:type="dxa" w:w="3010"/>
+          </w:tcPr>
+          <w:p>
+            <w:r>
+              <w:t>SP2-01</w:t>
+            </w:r>
+          </w:p>
+        </w:tc>
+        <w:tc>
+          <w:tcPr>
+            <w:tcW w:type="dxa" w:w="3010"/>
+          </w:tcPr>
+          <w:p>
+            <w:r>
+              <w:t>Definir el alcance y las exclusiones.</w:t>
+            </w:r>
+          </w:p>
+        </w:tc>
+        <w:tc>
+          <w:tcPr>
+            <w:tcW w:type="dxa" w:w="3010"/>
+          </w:tcPr>
+          <w:p>
+            <w:r>
+              <w:t>Ambos</w:t>
+            </w:r>
+          </w:p>
+        </w:tc>
+      </w:tr>
+      <w:tr>
+        <w:tc>
+          <w:tcPr>
+            <w:tcW w:type="dxa" w:w="3010"/>
+          </w:tcPr>
+          <w:p>
+            <w:r>
+              <w:t>SP2-02</w:t>
+            </w:r>
+          </w:p>
+        </w:tc>
+        <w:tc>
+          <w:tcPr>
+            <w:tcW w:type="dxa" w:w="3010"/>
+          </w:tcPr>
+          <w:p>
+            <w:r>
+              <w:t>Identificar las necesidades.</w:t>
+            </w:r>
+          </w:p>
+        </w:tc>
+        <w:tc>
+          <w:tcPr>
+            <w:tcW w:type="dxa" w:w="3010"/>
+          </w:tcPr>
+          <w:p>
+            <w:r>
+              <w:t>Miguel</w:t>
+            </w:r>
+          </w:p>
+        </w:tc>
+      </w:tr>
+      <w:tr>
+        <w:tc>
+          <w:tcPr>
+            <w:tcW w:type="dxa" w:w="3010"/>
+          </w:tcPr>
+          <w:p>
+            <w:r>
+              <w:t>SP2-03</w:t>
+            </w:r>
+          </w:p>
+        </w:tc>
+        <w:tc>
+          <w:tcPr>
+            <w:tcW w:type="dxa" w:w="3010"/>
+          </w:tcPr>
+          <w:p>
+            <w:r>
+              <w:t>Describir los procesos principales.</w:t>
+            </w:r>
+          </w:p>
+        </w:tc>
+        <w:tc>
+          <w:tcPr>
+            <w:tcW w:type="dxa" w:w="3010"/>
+          </w:tcPr>
+          <w:p>
+            <w:r>
+              <w:t>Cristopher</w:t>
+            </w:r>
+          </w:p>
+        </w:tc>
+      </w:tr>
+      <w:tr>
+        <w:tc>
+          <w:tcPr>
+            <w:tcW w:type="dxa" w:w="3010"/>
+          </w:tcPr>
+          <w:p>
+            <w:r>
+              <w:t>SP2-04</w:t>
+            </w:r>
+          </w:p>
+        </w:tc>
+        <w:tc>
+          <w:tcPr>
+            <w:tcW w:type="dxa" w:w="3010"/>
+          </w:tcPr>
+          <w:p>
+            <w:r>
+              <w:t>Definir las reglas de negocio.</w:t>
+            </w:r>
+          </w:p>
+        </w:tc>
+        <w:tc>
+          <w:tcPr>
+            <w:tcW w:type="dxa" w:w="3010"/>
+          </w:tcPr>
+          <w:p>
+            <w:r>
+              <w:t>Ambos</w:t>
+            </w:r>
+          </w:p>
+        </w:tc>
+      </w:tr>
+      <w:tr>
+        <w:tc>
+          <w:tcPr>
+            <w:tcW w:type="dxa" w:w="3010"/>
+          </w:tcPr>
+          <w:p>
+            <w:r>
+              <w:t>SP2-05</w:t>
+            </w:r>
+          </w:p>
+        </w:tc>
+        <w:tc>
+          <w:tcPr>
+            <w:tcW w:type="dxa" w:w="3010"/>
+          </w:tcPr>
+          <w:p>
+            <w:r>
+              <w:t>Establecer criterios de comprobación.</w:t>
+            </w:r>
+          </w:p>
+        </w:tc>
+        <w:tc>
+          <w:tcPr>
+            <w:tcW w:type="dxa" w:w="3010"/>
+          </w:tcPr>
+          <w:p>
+            <w:r>
+              <w:t>Miguel</w:t>
+            </w:r>
+          </w:p>
+        </w:tc>
+      </w:tr>
+      <w:tr>
+        <w:tc>
+          <w:tcPr>
+            <w:tcW w:type="dxa" w:w="3010"/>
+          </w:tcPr>
+          <w:p>
+            <w:r>
+              <w:t>SP2-06</w:t>
+            </w:r>
+          </w:p>
+        </w:tc>
+        <w:tc>
+          <w:tcPr>
+            <w:tcW w:type="dxa" w:w="3010"/>
+          </w:tcPr>
+          <w:p>
+            <w:r>
+              <w:t>Definir el ciclo de vida.</w:t>
+            </w:r>
+          </w:p>
+        </w:tc>
+        <w:tc>
+          <w:tcPr>
+            <w:tcW w:type="dxa" w:w="3010"/>
+          </w:tcPr>
+          <w:p>
+            <w:r>
+              <w:t>Ambos</w:t>
+            </w:r>
+          </w:p>
+        </w:tc>
+      </w:tr>
+      <w:tr>
+        <w:tc>
+          <w:tcPr>
+            <w:tcW w:type="dxa" w:w="3010"/>
+          </w:tcPr>
+          <w:p>
+            <w:r>
+              <w:t>SP2-07</w:t>
+            </w:r>
+          </w:p>
+        </w:tc>
+        <w:tc>
+          <w:tcPr>
+            <w:tcW w:type="dxa" w:w="3010"/>
+          </w:tcPr>
+          <w:p>
+            <w:r>
+              <w:t>Elaborar el Product Backlog.</w:t>
+            </w:r>
+          </w:p>
+        </w:tc>
+        <w:tc>
+          <w:tcPr>
+            <w:tcW w:type="dxa" w:w="3010"/>
+          </w:tcPr>
+          <w:p>
+            <w:r>
+              <w:t>Cristopher</w:t>
+            </w:r>
+          </w:p>
+        </w:tc>
+      </w:tr>
+      <w:tr>
+        <w:tc>
+          <w:tcPr>
+            <w:tcW w:type="dxa" w:w="3010"/>
+          </w:tcPr>
+          <w:p>
+            <w:r>
+              <w:t>SP2-08</w:t>
+            </w:r>
+          </w:p>
+        </w:tc>
+        <w:tc>
+          <w:tcPr>
+            <w:tcW w:type="dxa" w:w="3010"/>
+          </w:tcPr>
+          <w:p>
+            <w:r>
+              <w:t>Registrar el seguimiento.</w:t>
+            </w:r>
+          </w:p>
+        </w:tc>
+        <w:tc>
+          <w:tcPr>
+            <w:tcW w:type="dxa" w:w="3010"/>
+          </w:tcPr>
+          <w:p>
+            <w:r>
+              <w:t>Ambos</w:t>
+            </w:r>
+          </w:p>
+        </w:tc>
+      </w:tr>
+    </w:tbl>
+    <w:p>
+      <w:pPr>
+        <w:pStyle w:val="Heading1"/>
+      </w:pPr>
+      <w:r>
+        <w:t>17. Mecanismo de seguimiento</w:t>
+      </w:r>
+    </w:p>
+    <w:p>
+      <w:r>
+        <w:t>El seguimiento se registra en docs/seguimiento-sprint-2.md con los estados Pendiente, En proceso y Terminado. Como el equipo solamente tiene dos integrantes, no se harán reuniones diarias formales. Cuando alguno trabaje en una actividad, actualizará su estado. Los commits permiten consultar los cambios realizados.</w:t>
+      </w:r>
+    </w:p>
+    <w:p>
+      <w:r>
+        <w:t>Antes de entregar, ambos integrantes revisarán que las actividades estén completas y que el README y este documento tengan la misma información.</w:t>
       </w:r>
     </w:p>
     <w:sectPr>

</xml_diff>